<commit_message>
limpieza: eliminar Proyecto Final duplicado, actualizar Proyecto_Final
</commit_message>
<xml_diff>
--- a/Proyecto_Final/PROYECTO FINAL-20260414T140458Z-3-001/PROYECTO FINAL/PROYECTO FINAL - G8.docx
+++ b/Proyecto_Final/PROYECTO FINAL-20260414T140458Z-3-001/PROYECTO FINAL/PROYECTO FINAL - G8.docx
@@ -77,12 +77,12 @@
           <wp:inline distB="114300" distT="114300" distL="114300" distR="114300">
             <wp:extent cx="2113125" cy="1650090"/>
             <wp:effectExtent b="0" l="0" r="0" t="0"/>
-            <wp:docPr id="7" name="image2.png"/>
+            <wp:docPr id="7" name="image1.png"/>
             <a:graphic>
               <a:graphicData uri="http://schemas.openxmlformats.org/drawingml/2006/picture">
                 <pic:pic>
                   <pic:nvPicPr>
-                    <pic:cNvPr id="0" name="image2.png"/>
+                    <pic:cNvPr id="0" name="image1.png"/>
                     <pic:cNvPicPr preferRelativeResize="0"/>
                   </pic:nvPicPr>
                   <pic:blipFill>
@@ -541,7 +541,7 @@
     </w:p>
     <w:sdt>
       <w:sdtPr>
-        <w:id w:val="-1204426627"/>
+        <w:id w:val="-2123786209"/>
         <w:docPartObj>
           <w:docPartGallery w:val="Table of Contents"/>
           <w:docPartUnique w:val="1"/>
@@ -10570,12 +10570,12 @@
           <wp:inline distB="114300" distT="114300" distL="114300" distR="114300">
             <wp:extent cx="3255641" cy="4738688"/>
             <wp:effectExtent b="0" l="0" r="0" t="0"/>
-            <wp:docPr id="6" name="image6.png"/>
+            <wp:docPr id="6" name="image4.png"/>
             <a:graphic>
               <a:graphicData uri="http://schemas.openxmlformats.org/drawingml/2006/picture">
                 <pic:pic>
                   <pic:nvPicPr>
-                    <pic:cNvPr id="0" name="image6.png"/>
+                    <pic:cNvPr id="0" name="image4.png"/>
                     <pic:cNvPicPr preferRelativeResize="0"/>
                   </pic:nvPicPr>
                   <pic:blipFill>
@@ -26860,12 +26860,12 @@
           <wp:inline distB="114300" distT="114300" distL="114300" distR="114300">
             <wp:extent cx="4862513" cy="3098800"/>
             <wp:effectExtent b="0" l="0" r="0" t="0"/>
-            <wp:docPr descr="Gráfico" id="3" name="image4.png"/>
+            <wp:docPr descr="Gráfico" id="3" name="image3.png"/>
             <a:graphic>
               <a:graphicData uri="http://schemas.openxmlformats.org/drawingml/2006/picture">
                 <pic:pic>
                   <pic:nvPicPr>
-                    <pic:cNvPr descr="Gráfico" id="0" name="image4.png"/>
+                    <pic:cNvPr descr="Gráfico" id="0" name="image3.png"/>
                     <pic:cNvPicPr preferRelativeResize="0"/>
                   </pic:nvPicPr>
                   <pic:blipFill>
@@ -27538,12 +27538,12 @@
           <wp:inline distB="114300" distT="114300" distL="114300" distR="114300">
             <wp:extent cx="6581775" cy="4934941"/>
             <wp:effectExtent b="0" l="0" r="0" t="0"/>
-            <wp:docPr id="1" name="image3.png"/>
+            <wp:docPr id="1" name="image2.png"/>
             <a:graphic>
               <a:graphicData uri="http://schemas.openxmlformats.org/drawingml/2006/picture">
                 <pic:pic>
                   <pic:nvPicPr>
-                    <pic:cNvPr id="0" name="image3.png"/>
+                    <pic:cNvPr id="0" name="image2.png"/>
                     <pic:cNvPicPr preferRelativeResize="0"/>
                   </pic:nvPicPr>
                   <pic:blipFill>
@@ -27658,12 +27658,12 @@
           <wp:inline distB="114300" distT="114300" distL="114300" distR="114300">
             <wp:extent cx="5731200" cy="3759200"/>
             <wp:effectExtent b="0" l="0" r="0" t="0"/>
-            <wp:docPr id="4" name="image5.png"/>
+            <wp:docPr id="4" name="image6.png"/>
             <a:graphic>
               <a:graphicData uri="http://schemas.openxmlformats.org/drawingml/2006/picture">
                 <pic:pic>
                   <pic:nvPicPr>
-                    <pic:cNvPr id="0" name="image5.png"/>
+                    <pic:cNvPr id="0" name="image6.png"/>
                     <pic:cNvPicPr preferRelativeResize="0"/>
                   </pic:nvPicPr>
                   <pic:blipFill>
@@ -27828,12 +27828,12 @@
           <wp:extent cx="1290638" cy="476796"/>
           <wp:effectExtent b="0" l="0" r="0" t="0"/>
           <wp:wrapNone/>
-          <wp:docPr id="2" name="image1.png"/>
+          <wp:docPr id="2" name="image5.png"/>
           <a:graphic>
             <a:graphicData uri="http://schemas.openxmlformats.org/drawingml/2006/picture">
               <pic:pic>
                 <pic:nvPicPr>
-                  <pic:cNvPr id="0" name="image1.png"/>
+                  <pic:cNvPr id="0" name="image5.png"/>
                   <pic:cNvPicPr preferRelativeResize="0"/>
                 </pic:nvPicPr>
                 <pic:blipFill>

</xml_diff>